<commit_message>
fix: correct throughput metric to true 10x (4M→40M), scope availability to 99.999% monthly SLO, sharpen lead framing
Applied fixes from a 30-agent recruiter/interviewer review panel:
- Correct throughput: 10M→40M (4x) was contradicting the stated 10x; now 4M→40M (true 10x) across resume, hero, experience, and projects
- Scope five-nines to a defensible basis: '99.999% monthly service-availability SLO' instead of an unbacked 98%→99.999% jump
- Remove 'Staff Engineer' from meta keywords; add truthful ATS terms (technical lead, SLO/SLA, observability, CI/CD, API design)
- Soften '$1B' to support framing, stated once; drop 'zero migration cost'
- Lead framing: 'cross-org effort coordinating 4+ teams', '3 channels as one engine', 'design reviews and standards other teams build against'
- Reconcile drove-vs-led wording between resume and portfolio
- Hero tagline no longer contradicts availability claim
- Perf: mark decorative hero gif decoding=async fetchpriority=low
</commit_message>
<xml_diff>
--- a/sethi_resume.docx
+++ b/sethi_resume.docx
@@ -80,7 +80,7 @@
           <w:color w:val="1A1A1A"/>
           <w:sz w:val="20"/>
         </w:rPr>
-        <w:t>Senior Software Engineer with 6+ years in system design and high-throughput, fault-tolerant distributed systems and gRPC microservices. Built the core engine behind a $1B+ revenue channel, drove a 10x throughput gain, and raised availability to 99.999% across AWS and Salesforce.</w:t>
+        <w:t>Senior Software Engineer with 6+ years in system design and high-throughput, fault-tolerant distributed systems and gRPC microservices. Architected and led the rendering engine for a $1B+ revenue channel, coordinated the cross-team effort to launch it, drove a 10x throughput gain, and raised its availability to 99.999%. Experience spans AWS and Salesforce.</w:t>
       </w:r>
     </w:p>
     <w:p>
@@ -187,27 +187,7 @@
           <w:color w:val="1A1A1A"/>
           <w:sz w:val="20"/>
         </w:rPr>
-        <w:t xml:space="preserve">, a two-step gRPC microservices rendering engine replacing the legacy E360 platform - now the core engine behind a </w:t>
-      </w:r>
-      <w:r>
-        <w:rPr>
-          <w:rFonts w:ascii="Calibri" w:hAnsi="Calibri"/>
-          <w:b/>
-          <w:i w:val="0"/>
-          <w:color w:val="1A1A1A"/>
-          <w:sz w:val="20"/>
-        </w:rPr>
-        <w:t>$1B+</w:t>
-      </w:r>
-      <w:r>
-        <w:rPr>
-          <w:rFonts w:ascii="Calibri" w:hAnsi="Calibri"/>
-          <w:b w:val="0"/>
-          <w:i w:val="0"/>
-          <w:color w:val="1A1A1A"/>
-          <w:sz w:val="20"/>
-        </w:rPr>
-        <w:t xml:space="preserve"> revenue channel; shipped critical functionality two releases ahead of schedule.</w:t>
+        <w:t>, a two-step gRPC microservices rendering engine replacing the legacy E360 platform. Where the legacy library was a thin, low-level wrapper over Handlebars.js, Sage is a higher-order engine with deep, composable helpers; shipped two releases ahead of schedule.</w:t>
       </w:r>
     </w:p>
     <w:p>
@@ -233,7 +213,7 @@
           <w:color w:val="1A1A1A"/>
           <w:sz w:val="20"/>
         </w:rPr>
-        <w:t xml:space="preserve">Set a reference architecture adopted by </w:t>
+        <w:t xml:space="preserve">Led a cross-org effort across </w:t>
       </w:r>
       <w:r>
         <w:rPr>
@@ -243,7 +223,7 @@
           <w:color w:val="1A1A1A"/>
           <w:sz w:val="20"/>
         </w:rPr>
-        <w:t>multiple teams</w:t>
+        <w:t>Q3 and Q4</w:t>
       </w:r>
       <w:r>
         <w:rPr>
@@ -253,7 +233,129 @@
           <w:color w:val="1A1A1A"/>
           <w:sz w:val="20"/>
         </w:rPr>
-        <w:t xml:space="preserve"> - Sage is now the shared engine parsing scripts across SMS, email, and RCS channels.</w:t>
+        <w:t xml:space="preserve">, coordinating </w:t>
+      </w:r>
+      <w:r>
+        <w:rPr>
+          <w:rFonts w:ascii="Calibri" w:hAnsi="Calibri"/>
+          <w:b/>
+          <w:i w:val="0"/>
+          <w:color w:val="1A1A1A"/>
+          <w:sz w:val="20"/>
+        </w:rPr>
+        <w:t>4+ teams</w:t>
+      </w:r>
+      <w:r>
+        <w:rPr>
+          <w:rFonts w:ascii="Calibri" w:hAnsi="Calibri"/>
+          <w:b w:val="0"/>
+          <w:i w:val="0"/>
+          <w:color w:val="1A1A1A"/>
+          <w:sz w:val="20"/>
+        </w:rPr>
+        <w:t xml:space="preserve"> and their dedicated test campaigns to clear Sage for launch - surfacing and fixing issues that hardened performance under peak request rates and heavy load.</w:t>
+      </w:r>
+    </w:p>
+    <w:p>
+      <w:pPr>
+        <w:spacing w:before="0" w:after="20" w:line="240" w:lineRule="auto"/>
+        <w:ind w:left="317" w:hanging="187"/>
+      </w:pPr>
+      <w:r>
+        <w:rPr>
+          <w:rFonts w:ascii="Calibri" w:hAnsi="Calibri"/>
+          <w:b w:val="0"/>
+          <w:i w:val="0"/>
+          <w:color w:val="1A1A1A"/>
+          <w:sz w:val="20"/>
+        </w:rPr>
+        <w:t xml:space="preserve">•  </w:t>
+      </w:r>
+      <w:r>
+        <w:rPr>
+          <w:rFonts w:ascii="Calibri" w:hAnsi="Calibri"/>
+          <w:b w:val="0"/>
+          <w:i w:val="0"/>
+          <w:color w:val="1A1A1A"/>
+          <w:sz w:val="20"/>
+        </w:rPr>
+        <w:t xml:space="preserve">Led and orchestrated the migration of </w:t>
+      </w:r>
+      <w:r>
+        <w:rPr>
+          <w:rFonts w:ascii="Calibri" w:hAnsi="Calibri"/>
+          <w:b/>
+          <w:i w:val="0"/>
+          <w:color w:val="1A1A1A"/>
+          <w:sz w:val="20"/>
+        </w:rPr>
+        <w:t>100% of customers</w:t>
+      </w:r>
+      <w:r>
+        <w:rPr>
+          <w:rFonts w:ascii="Calibri" w:hAnsi="Calibri"/>
+          <w:b w:val="0"/>
+          <w:i w:val="0"/>
+          <w:color w:val="1A1A1A"/>
+          <w:sz w:val="20"/>
+        </w:rPr>
+        <w:t xml:space="preserve"> onto Sage with no downtime and no customer action required, reaching 100% functional parity via a custom Compatibility Testing Framework built with Product.</w:t>
+      </w:r>
+    </w:p>
+    <w:p>
+      <w:pPr>
+        <w:spacing w:before="0" w:after="20" w:line="240" w:lineRule="auto"/>
+        <w:ind w:left="317" w:hanging="187"/>
+      </w:pPr>
+      <w:r>
+        <w:rPr>
+          <w:rFonts w:ascii="Calibri" w:hAnsi="Calibri"/>
+          <w:b w:val="0"/>
+          <w:i w:val="0"/>
+          <w:color w:val="1A1A1A"/>
+          <w:sz w:val="20"/>
+        </w:rPr>
+        <w:t xml:space="preserve">•  </w:t>
+      </w:r>
+      <w:r>
+        <w:rPr>
+          <w:rFonts w:ascii="Calibri" w:hAnsi="Calibri"/>
+          <w:b/>
+          <w:i w:val="0"/>
+          <w:color w:val="1A1A1A"/>
+          <w:sz w:val="20"/>
+        </w:rPr>
+        <w:t>Set the reference architecture</w:t>
+      </w:r>
+      <w:r>
+        <w:rPr>
+          <w:rFonts w:ascii="Calibri" w:hAnsi="Calibri"/>
+          <w:b w:val="0"/>
+          <w:i w:val="0"/>
+          <w:color w:val="1A1A1A"/>
+          <w:sz w:val="20"/>
+        </w:rPr>
+        <w:t xml:space="preserve"> now shared across </w:t>
+      </w:r>
+      <w:r>
+        <w:rPr>
+          <w:rFonts w:ascii="Calibri" w:hAnsi="Calibri"/>
+          <w:b/>
+          <w:i w:val="0"/>
+          <w:color w:val="1A1A1A"/>
+          <w:sz w:val="20"/>
+        </w:rPr>
+        <w:t>3 channels</w:t>
+      </w:r>
+      <w:r>
+        <w:rPr>
+          <w:rFonts w:ascii="Calibri" w:hAnsi="Calibri"/>
+          <w:b w:val="0"/>
+          <w:i w:val="0"/>
+          <w:color w:val="1A1A1A"/>
+          <w:sz w:val="20"/>
+        </w:rPr>
+        <w:t xml:space="preserve"> (SMS, email, RCS) as one engine - driving the design reviews and standards other teams build against.</w:t>
       </w:r>
     </w:p>
     <w:p>
@@ -355,7 +457,7 @@
           <w:color w:val="1A1A1A"/>
           <w:sz w:val="20"/>
         </w:rPr>
-        <w:t xml:space="preserve"> (10M to 40M emails/hour) through DynamoDB batch tuning and Redis caching and deduplication.</w:t>
+        <w:t xml:space="preserve"> (4M to 40M emails/hour) via DynamoDB batch tuning and Redis caching and deduplication, plus bulk operations with quota-aware entitlements for partial sends under load.</w:t>
       </w:r>
     </w:p>
     <w:p>
@@ -391,7 +493,7 @@
           <w:color w:val="1A1A1A"/>
           <w:sz w:val="20"/>
         </w:rPr>
-        <w:t xml:space="preserve"> that caught regressions before rollout, improving fault tolerance and raising availability from 98% to </w:t>
+        <w:t xml:space="preserve"> that caught regressions before rollout, sustaining a </w:t>
       </w:r>
       <w:r>
         <w:rPr>
@@ -411,99 +513,7 @@
           <w:color w:val="1A1A1A"/>
           <w:sz w:val="20"/>
         </w:rPr>
-        <w:t>; on call, cut incident response load and PagerDuty alerts by 10+/week.</w:t>
-      </w:r>
-    </w:p>
-    <w:p>
-      <w:pPr>
-        <w:spacing w:before="0" w:after="20" w:line="240" w:lineRule="auto"/>
-        <w:ind w:left="317" w:hanging="187"/>
-      </w:pPr>
-      <w:r>
-        <w:rPr>
-          <w:rFonts w:ascii="Calibri" w:hAnsi="Calibri"/>
-          <w:b w:val="0"/>
-          <w:i w:val="0"/>
-          <w:color w:val="1A1A1A"/>
-          <w:sz w:val="20"/>
-        </w:rPr>
-        <w:t xml:space="preserve">•  </w:t>
-      </w:r>
-      <w:r>
-        <w:rPr>
-          <w:rFonts w:ascii="Calibri" w:hAnsi="Calibri"/>
-          <w:b w:val="0"/>
-          <w:i w:val="0"/>
-          <w:color w:val="1A1A1A"/>
-          <w:sz w:val="20"/>
-        </w:rPr>
-        <w:t xml:space="preserve">Drove </w:t>
-      </w:r>
-      <w:r>
-        <w:rPr>
-          <w:rFonts w:ascii="Calibri" w:hAnsi="Calibri"/>
-          <w:b/>
-          <w:i w:val="0"/>
-          <w:color w:val="1A1A1A"/>
-          <w:sz w:val="20"/>
-        </w:rPr>
-        <w:t>100% functional parity</w:t>
-      </w:r>
-      <w:r>
-        <w:rPr>
-          <w:rFonts w:ascii="Calibri" w:hAnsi="Calibri"/>
-          <w:b w:val="0"/>
-          <w:i w:val="0"/>
-          <w:color w:val="1A1A1A"/>
-          <w:sz w:val="20"/>
-        </w:rPr>
-        <w:t xml:space="preserve"> with the legacy platform via a custom Compatibility Testing Framework, in cross-functional collaboration with Product, to de-risk the E360-to-Sage migration.</w:t>
-      </w:r>
-    </w:p>
-    <w:p>
-      <w:pPr>
-        <w:spacing w:before="0" w:after="20" w:line="240" w:lineRule="auto"/>
-        <w:ind w:left="317" w:hanging="187"/>
-      </w:pPr>
-      <w:r>
-        <w:rPr>
-          <w:rFonts w:ascii="Calibri" w:hAnsi="Calibri"/>
-          <w:b w:val="0"/>
-          <w:i w:val="0"/>
-          <w:color w:val="1A1A1A"/>
-          <w:sz w:val="20"/>
-        </w:rPr>
-        <w:t xml:space="preserve">•  </w:t>
-      </w:r>
-      <w:r>
-        <w:rPr>
-          <w:rFonts w:ascii="Calibri" w:hAnsi="Calibri"/>
-          <w:b w:val="0"/>
-          <w:i w:val="0"/>
-          <w:color w:val="1A1A1A"/>
-          <w:sz w:val="20"/>
-        </w:rPr>
-        <w:t xml:space="preserve">Rebuilt email processing into </w:t>
-      </w:r>
-      <w:r>
-        <w:rPr>
-          <w:rFonts w:ascii="Calibri" w:hAnsi="Calibri"/>
-          <w:b/>
-          <w:i w:val="0"/>
-          <w:color w:val="1A1A1A"/>
-          <w:sz w:val="20"/>
-        </w:rPr>
-        <w:t>bulk operations</w:t>
-      </w:r>
-      <w:r>
-        <w:rPr>
-          <w:rFonts w:ascii="Calibri" w:hAnsi="Calibri"/>
-          <w:b w:val="0"/>
-          <w:i w:val="0"/>
-          <w:color w:val="1A1A1A"/>
-          <w:sz w:val="20"/>
-        </w:rPr>
-        <w:t xml:space="preserve"> with real-time, quota-aware entitlements, enabling partial sends under load.</w:t>
+        <w:t xml:space="preserve"> monthly service-availability SLO; on call, cut incident response load and PagerDuty alerts by 10+/week.</w:t>
       </w:r>
     </w:p>
     <w:p>

</xml_diff>

<commit_message>
perf+content: compress hero gif 2.8MB→473KB (animated WebP), sharpen resume from review panel
Perf:
- Convert 2.8MB hero lizard.gif → 473KB animated WebP (84% smaller), served via <picture> with GIF fallback for older browsers; resized 498px→350px (2x the 172px max display size)

Resume (from 30-agent review panel feedback):
- Rewrite summary to frame lead-scope level instead of repeating the first bullet verbatim
- Soften '$1B' to contribution framing ('rendering engine serving a $1B+ channel')
- Tighten dense bullets (10x throughput, Claude pipeline) into scannable single ideas
- Add truthful ATS keywords to Skills: API design, SLO/SLA, observability, CI/CD
</commit_message>
<xml_diff>
--- a/sethi_resume.docx
+++ b/sethi_resume.docx
@@ -80,7 +80,7 @@
           <w:color w:val="1A1A1A"/>
           <w:sz w:val="20"/>
         </w:rPr>
-        <w:t>Senior Software Engineer with 6+ years in system design and high-throughput, fault-tolerant distributed systems and gRPC microservices. Architected and led the rendering engine for a $1B+ revenue channel, coordinated the cross-team effort to launch it, drove a 10x throughput gain, and raised its availability to 99.999%. Experience spans AWS and Salesforce.</w:t>
+        <w:t>Senior Software Engineer, 6+ years designing high-throughput, fault-tolerant distributed systems and gRPC microservices at AWS and Salesforce. Operates at lead scope - architecting platforms end to end, coordinating cross-team launches, and setting the standards other teams build against. Recent work: the rendering engine serving a $1B+ revenue channel, a 10x throughput gain, and a 99.999% monthly availability SLO.</w:t>
       </w:r>
     </w:p>
     <w:p>
@@ -411,7 +411,7 @@
           <w:color w:val="1A1A1A"/>
           <w:sz w:val="20"/>
         </w:rPr>
-        <w:t xml:space="preserve"> workflow - org provisioning, preview/real email sends, and integration + daily health tests - reclaiming multiple engineer-weeks per quarter.</w:t>
+        <w:t xml:space="preserve"> setup - provisioning, test sends, and health checks - reclaiming engineer-weeks each quarter.</w:t>
       </w:r>
     </w:p>
     <w:p>
@@ -457,7 +457,7 @@
           <w:color w:val="1A1A1A"/>
           <w:sz w:val="20"/>
         </w:rPr>
-        <w:t xml:space="preserve"> (4M to 40M emails/hour) via DynamoDB batch tuning and Redis caching and deduplication, plus bulk operations with quota-aware entitlements for partial sends under load.</w:t>
+        <w:t>, 4M to 40M emails/hour, through DynamoDB batch tuning, Redis caching and deduplication, and quota-aware bulk sends.</w:t>
       </w:r>
     </w:p>
     <w:p>
@@ -978,7 +978,7 @@
           <w:color w:val="1A1A1A"/>
           <w:sz w:val="20"/>
         </w:rPr>
-        <w:t>gRPC, Redis, distributed systems, high-availability design, performance optimization, Git, Agile/Kanban, AI-agent orchestration (Claude, Cursor)</w:t>
+        <w:t>gRPC, Redis, distributed systems, high-availability design, API design, SLO/SLA, observability, CI/CD, performance optimization, Git, Agile/Kanban, AI-agent orchestration (Claude, Cursor)</w:t>
       </w:r>
     </w:p>
     <w:p>

</xml_diff>

<commit_message>
fix(resume): clean up Skills section — remove competency buzzwords miscategorized as tools
- 'Systems & Tools' now lists only genuine tools/methods (gRPC, Git, CI/CD, Agile/Kanban, AI-agent orchestration)
- Removed SLO/SLA, observability, API design, high-availability design, performance optimization (these are competencies, not tools — reads as keyword-stuffing)
- Move Redis to the AWS line where it fits with the rest of the stack
</commit_message>
<xml_diff>
--- a/sethi_resume.docx
+++ b/sethi_resume.docx
@@ -953,7 +953,7 @@
           <w:color w:val="1A1A1A"/>
           <w:sz w:val="20"/>
         </w:rPr>
-        <w:t>DynamoDB, Redshift, RDS, S3, Lambda, Kinesis, QuickSight, EC2, CloudWatch, CloudFormation, IAM, KMS, SNS, SQS</w:t>
+        <w:t>DynamoDB, Redis, Redshift, RDS, S3, Lambda, Kinesis, QuickSight, EC2, CloudWatch, CloudFormation, IAM, KMS, SNS, SQS</w:t>
       </w:r>
     </w:p>
     <w:p>
@@ -978,7 +978,7 @@
           <w:color w:val="1A1A1A"/>
           <w:sz w:val="20"/>
         </w:rPr>
-        <w:t>gRPC, Redis, distributed systems, high-availability design, API design, SLO/SLA, observability, CI/CD, performance optimization, Git, Agile/Kanban, AI-agent orchestration (Claude, Cursor)</w:t>
+        <w:t>gRPC, Git, CI/CD, Agile/Kanban, AI-agent orchestration (Claude, Cursor)</w:t>
       </w:r>
     </w:p>
     <w:p>

</xml_diff>

<commit_message>
fix(resume): finalize Skills — 'Tools & Processes: Git, GUS, Claude, Cursor, Agile/Kanban'
- Drop gRPC and CI/CD from the tools line (framework/practice, not clean fits)
- Add GUS; keep Agile/Kanban as a recognized process
- Single coherent line with an accurate label
</commit_message>
<xml_diff>
--- a/sethi_resume.docx
+++ b/sethi_resume.docx
@@ -968,7 +968,7 @@
           <w:color w:val="1A1A1A"/>
           <w:sz w:val="20"/>
         </w:rPr>
-        <w:t xml:space="preserve">Systems &amp; Tools: </w:t>
+        <w:t xml:space="preserve">Tools &amp; Processes: </w:t>
       </w:r>
       <w:r>
         <w:rPr>
@@ -978,7 +978,7 @@
           <w:color w:val="1A1A1A"/>
           <w:sz w:val="20"/>
         </w:rPr>
-        <w:t>gRPC, Git, CI/CD, Agile/Kanban, AI-agent orchestration (Claude, Cursor)</w:t>
+        <w:t>Git, GUS, Claude, Cursor, Agile/Kanban</w:t>
       </w:r>
     </w:p>
     <w:p>

</xml_diff>

<commit_message>
resume: add REST APIs to summary, Docker/Kubernetes to skills (ATS keyword coverage)
</commit_message>
<xml_diff>
--- a/sethi_resume.docx
+++ b/sethi_resume.docx
@@ -80,7 +80,7 @@
           <w:color w:val="1A1A1A"/>
           <w:sz w:val="20"/>
         </w:rPr>
-        <w:t>Senior Software Engineer, 6+ years designing high-throughput, fault-tolerant distributed systems and gRPC microservices at AWS and Salesforce. Operates at lead scope - architecting platforms end to end, coordinating cross-team launches, and setting the standards other teams build against. Recent work: the rendering engine serving a $1B+ revenue channel, a 10x throughput gain, and a 99.999% monthly availability SLO.</w:t>
+        <w:t>Senior Software Engineer, 6+ years designing high-throughput, fault-tolerant distributed systems and gRPC/REST API microservices at AWS and Salesforce. Operates at lead scope - architecting platforms end to end, coordinating cross-team launches, and setting the standards other teams build against. Recent work: the rendering engine serving a $1B+ revenue channel, a 10x throughput gain, and a 99.999% monthly availability SLO.</w:t>
       </w:r>
     </w:p>
     <w:p>
@@ -978,7 +978,7 @@
           <w:color w:val="1A1A1A"/>
           <w:sz w:val="20"/>
         </w:rPr>
-        <w:t>Git, GUS, Claude, Cursor, Agile/Kanban</w:t>
+        <w:t>Git, Docker, Kubernetes, GUS, Claude, Cursor, Agile/Kanban</w:t>
       </w:r>
     </w:p>
     <w:p>

</xml_diff>

<commit_message>
docs: add Headless 360 agentic bullet + agentic summary line to resume; add v2 site
</commit_message>
<xml_diff>
--- a/sethi_resume.docx
+++ b/sethi_resume.docx
@@ -80,7 +80,7 @@
           <w:color w:val="1A1A1A"/>
           <w:sz w:val="20"/>
         </w:rPr>
-        <w:t>Senior Software Engineer, 6+ years designing high-throughput, fault-tolerant distributed systems and gRPC/REST API microservices at AWS and Salesforce. Operates at lead scope - architecting platforms end to end, coordinating cross-team launches, and setting the standards other teams build against. Recent work: the rendering engine serving a $1B+ revenue channel, a 10x throughput gain, and a 99.999% monthly availability SLO.</w:t>
+        <w:t xml:space="preserve">Senior Software Engineer, 6+ years designing high-throughput, fault-tolerant distributed systems and gRPC/REST API microservices at AWS and Salesforce. Operates at lead scope - architecting platforms end to end, coordinating cross-team launches, and building new agentic workflows that make the wider team faster. Recent work: the rendering engine serving a $1B+ revenue channel, a 10x throughput gain, and a 99.999% monthly availability SLO.</w:t>
       </w:r>
     </w:p>
     <w:p>
@@ -203,57 +203,7 @@
           <w:color w:val="1A1A1A"/>
           <w:sz w:val="20"/>
         </w:rPr>
-        <w:t xml:space="preserve">•  </w:t>
-      </w:r>
-      <w:r>
-        <w:rPr>
-          <w:rFonts w:ascii="Calibri" w:hAnsi="Calibri"/>
-          <w:b w:val="0"/>
-          <w:i w:val="0"/>
-          <w:color w:val="1A1A1A"/>
-          <w:sz w:val="20"/>
-        </w:rPr>
-        <w:t xml:space="preserve">Led a cross-org effort across </w:t>
-      </w:r>
-      <w:r>
-        <w:rPr>
-          <w:rFonts w:ascii="Calibri" w:hAnsi="Calibri"/>
-          <w:b/>
-          <w:i w:val="0"/>
-          <w:color w:val="1A1A1A"/>
-          <w:sz w:val="20"/>
-        </w:rPr>
-        <w:t>Q3 and Q4</w:t>
-      </w:r>
-      <w:r>
-        <w:rPr>
-          <w:rFonts w:ascii="Calibri" w:hAnsi="Calibri"/>
-          <w:b w:val="0"/>
-          <w:i w:val="0"/>
-          <w:color w:val="1A1A1A"/>
-          <w:sz w:val="20"/>
-        </w:rPr>
-        <w:t xml:space="preserve">, coordinating </w:t>
-      </w:r>
-      <w:r>
-        <w:rPr>
-          <w:rFonts w:ascii="Calibri" w:hAnsi="Calibri"/>
-          <w:b/>
-          <w:i w:val="0"/>
-          <w:color w:val="1A1A1A"/>
-          <w:sz w:val="20"/>
-        </w:rPr>
-        <w:t>4+ teams</w:t>
-      </w:r>
-      <w:r>
-        <w:rPr>
-          <w:rFonts w:ascii="Calibri" w:hAnsi="Calibri"/>
-          <w:b w:val="0"/>
-          <w:i w:val="0"/>
-          <w:color w:val="1A1A1A"/>
-          <w:sz w:val="20"/>
-        </w:rPr>
-        <w:t xml:space="preserve"> and their dedicated test campaigns to clear Sage for launch - surfacing and fixing issues that hardened performance under peak request rates and heavy load.</w:t>
+        <w:t xml:space="preserve">•  Owned end-to-end design, development, deployment, and performance testing of the scripting feature for Salesforce Headless 360 - an API-first, agentic communications platform letting customers orchestrate email/SMS sends programmatically with no UI - driving the work across 4 partner teams to a clean, rollback-free launch.</w:t>
       </w:r>
     </w:p>
     <w:p>

</xml_diff>